<commit_message>
Add SQLAlchemy auth persistence and Alembic setup
</commit_message>
<xml_diff>
--- a/Documents/Project Structure.docx
+++ b/Documents/Project Structure.docx
@@ -488,7 +488,19 @@
               <w:rPr>
                 <w:rFonts w:ascii="Times New Roman" w:hAnsi="Times New Roman" w:cs="Times New Roman"/>
               </w:rPr>
-              <w:t>Player dashboard, Game page, Results/history, optional Profile</w:t>
+              <w:t>Player dashboard, Game page, Results/history,</w:t>
+            </w:r>
+            <w:r>
+              <w:rPr>
+                <w:rFonts w:ascii="Times New Roman" w:hAnsi="Times New Roman" w:cs="Times New Roman"/>
+              </w:rPr>
+              <w:t xml:space="preserve"> Profile</w:t>
+            </w:r>
+            <w:r>
+              <w:rPr>
+                <w:rFonts w:ascii="Times New Roman" w:hAnsi="Times New Roman" w:cs="Times New Roman"/>
+              </w:rPr>
+              <w:t xml:space="preserve"> page</w:t>
             </w:r>
           </w:p>
         </w:tc>
@@ -650,7 +662,7 @@
           <w:sz w:val="17"/>
         </w:rPr>
         <w:br/>
-        <w:t>├── app.py / server.py / main.py</w:t>
+        <w:t xml:space="preserve">├── app.py </w:t>
       </w:r>
       <w:r>
         <w:rPr>
@@ -682,6 +694,12 @@
           <w:sz w:val="17"/>
         </w:rPr>
         <w:br/>
+      </w:r>
+      <w:r>
+        <w:rPr>
+          <w:rFonts w:ascii="Times New Roman" w:eastAsia="Courier New" w:hAnsi="Times New Roman" w:cs="Times New Roman"/>
+          <w:sz w:val="17"/>
+        </w:rPr>
         <w:t>│   ├── css/style.css</w:t>
       </w:r>
       <w:r>
@@ -889,7 +907,14 @@
           <w:sz w:val="17"/>
         </w:rPr>
         <w:br/>
-        <w:t xml:space="preserve">    └── validation.py</w:t>
+        <w:t xml:space="preserve">    └──</w:t>
+      </w:r>
+      <w:r>
+        <w:rPr>
+          <w:rFonts w:ascii="Times New Roman" w:eastAsia="Courier New" w:hAnsi="Times New Roman" w:cs="Times New Roman"/>
+          <w:sz w:val="17"/>
+        </w:rPr>
+        <w:t xml:space="preserve"> validation.py</w:t>
       </w:r>
     </w:p>
     <w:p>
@@ -1297,13 +1322,7 @@
               <w:rPr>
                 <w:rFonts w:ascii="Times New Roman" w:hAnsi="Times New Roman" w:cs="Times New Roman"/>
               </w:rPr>
-              <w:t>alice</w:t>
-            </w:r>
-            <w:r>
-              <w:rPr>
-                <w:rFonts w:ascii="Times New Roman" w:hAnsi="Times New Roman" w:cs="Times New Roman"/>
-              </w:rPr>
-              <w:t>1</w:t>
+              <w:t>alice1</w:t>
             </w:r>
           </w:p>
         </w:tc>
@@ -2088,8 +2107,16 @@
               <w:rPr>
                 <w:rFonts w:ascii="Times New Roman" w:hAnsi="Times New Roman" w:cs="Times New Roman"/>
               </w:rPr>
-              <w:t>/login</w:t>
+              <w:t>/</w:t>
             </w:r>
+            <w:proofErr w:type="gramStart"/>
+            <w:r>
+              <w:rPr>
+                <w:rFonts w:ascii="Times New Roman" w:hAnsi="Times New Roman" w:cs="Times New Roman"/>
+              </w:rPr>
+              <w:t>login</w:t>
+            </w:r>
+            <w:proofErr w:type="gramEnd"/>
           </w:p>
         </w:tc>
         <w:tc>
@@ -2141,8 +2168,16 @@
               <w:rPr>
                 <w:rFonts w:ascii="Times New Roman" w:hAnsi="Times New Roman" w:cs="Times New Roman"/>
               </w:rPr>
-              <w:t>/signup</w:t>
+              <w:t>/</w:t>
             </w:r>
+            <w:proofErr w:type="gramStart"/>
+            <w:r>
+              <w:rPr>
+                <w:rFonts w:ascii="Times New Roman" w:hAnsi="Times New Roman" w:cs="Times New Roman"/>
+              </w:rPr>
+              <w:t>signup</w:t>
+            </w:r>
+            <w:proofErr w:type="gramEnd"/>
           </w:p>
         </w:tc>
         <w:tc>
@@ -2194,8 +2229,16 @@
               <w:rPr>
                 <w:rFonts w:ascii="Times New Roman" w:hAnsi="Times New Roman" w:cs="Times New Roman"/>
               </w:rPr>
-              <w:t>/guest</w:t>
+              <w:t>/</w:t>
             </w:r>
+            <w:proofErr w:type="gramStart"/>
+            <w:r>
+              <w:rPr>
+                <w:rFonts w:ascii="Times New Roman" w:hAnsi="Times New Roman" w:cs="Times New Roman"/>
+              </w:rPr>
+              <w:t>guest</w:t>
+            </w:r>
+            <w:proofErr w:type="gramEnd"/>
           </w:p>
         </w:tc>
         <w:tc>
@@ -2300,8 +2343,16 @@
               <w:rPr>
                 <w:rFonts w:ascii="Times New Roman" w:hAnsi="Times New Roman" w:cs="Times New Roman"/>
               </w:rPr>
-              <w:t>/game</w:t>
+              <w:t>/</w:t>
             </w:r>
+            <w:proofErr w:type="gramStart"/>
+            <w:r>
+              <w:rPr>
+                <w:rFonts w:ascii="Times New Roman" w:hAnsi="Times New Roman" w:cs="Times New Roman"/>
+              </w:rPr>
+              <w:t>game</w:t>
+            </w:r>
+            <w:proofErr w:type="gramEnd"/>
           </w:p>
         </w:tc>
         <w:tc>
@@ -2353,8 +2404,16 @@
               <w:rPr>
                 <w:rFonts w:ascii="Times New Roman" w:hAnsi="Times New Roman" w:cs="Times New Roman"/>
               </w:rPr>
-              <w:t>/results</w:t>
+              <w:t>/</w:t>
             </w:r>
+            <w:proofErr w:type="gramStart"/>
+            <w:r>
+              <w:rPr>
+                <w:rFonts w:ascii="Times New Roman" w:hAnsi="Times New Roman" w:cs="Times New Roman"/>
+              </w:rPr>
+              <w:t>results</w:t>
+            </w:r>
+            <w:proofErr w:type="gramEnd"/>
           </w:p>
         </w:tc>
         <w:tc>
@@ -2565,8 +2624,16 @@
               <w:rPr>
                 <w:rFonts w:ascii="Times New Roman" w:hAnsi="Times New Roman" w:cs="Times New Roman"/>
               </w:rPr>
-              <w:t>/logout</w:t>
+              <w:t>/</w:t>
             </w:r>
+            <w:proofErr w:type="gramStart"/>
+            <w:r>
+              <w:rPr>
+                <w:rFonts w:ascii="Times New Roman" w:hAnsi="Times New Roman" w:cs="Times New Roman"/>
+              </w:rPr>
+              <w:t>logout</w:t>
+            </w:r>
+            <w:proofErr w:type="gramEnd"/>
           </w:p>
         </w:tc>
         <w:tc>
@@ -2892,7 +2959,13 @@
         <w:rPr>
           <w:rFonts w:ascii="Times New Roman" w:hAnsi="Times New Roman" w:cs="Times New Roman"/>
         </w:rPr>
-        <w:t>The system should be structured using a frontend, backend, and database design. The frontend contains the pages used by public users, players, guests, and administrators. The backend handles authentication, role-based access control, game logic, and data processing. The database stores persistent information such as user account details and player scores. The main data entities are Users and Scores, where one user may have many score records. The system should also separate player and administrator permissions to ensure secure access control.</w:t>
+        <w:t>The system should be structured using a frontend, backend, and database design. The frontend contains the pages used by public users, players, guests, and administrators. The backend handles authentication, role-based access control, game logic, and data processing. The database stores persistent information such as user account details and player scores. The main data entities are Users and Scores, where one user may have many score records. The system should also separate player and administrator permissi</w:t>
+      </w:r>
+      <w:r>
+        <w:rPr>
+          <w:rFonts w:ascii="Times New Roman" w:hAnsi="Times New Roman" w:cs="Times New Roman"/>
+        </w:rPr>
+        <w:t>ons to ensure secure access control.</w:t>
       </w:r>
     </w:p>
     <w:sectPr>

</xml_diff>